<commit_message>
Regenerate resumes/cover letters (2026-08-31_095432)
</commit_message>
<xml_diff>
--- a/generated/SDE/Dennis Dole Resume (SDE).docx
+++ b/generated/SDE/Dennis Dole Resume (SDE).docx
@@ -423,7 +423,7 @@
           <w:color w:val="1F3864"/>
           <w:sz w:val="18"/>
         </w:rPr>
-        <w:t>Docusign Connect · Connect Test Listener (webhook) · Ruby Webhook Test Interface · x509 Certificate Management</w:t>
+        <w:t>Docusign Connect, Connect Test Listener (webhook), Ruby Webhook Test Interface, x509 Certificate Management</w:t>
       </w:r>
     </w:p>
     <w:p>
@@ -495,7 +495,7 @@
               <w:rPr>
                 <w:b/>
               </w:rPr>
-              <w:t>Software Design Engineer in Test (SDET)</w:t>
+              <w:t>Software Design Engineer in Test</w:t>
             </w:r>
           </w:p>
         </w:tc>
@@ -544,7 +544,7 @@
           <w:color w:val="1F3864"/>
           <w:sz w:val="18"/>
         </w:rPr>
-        <w:t>Docusign Connect · Product Incubation Team · Docusign Print Tool (deprecated)</w:t>
+        <w:t>Docusign Connect, Product Incubation Team, Docusign Print Tool (deprecated)</w:t>
       </w:r>
     </w:p>
     <w:p>
@@ -728,7 +728,7 @@
           <w:color w:val="1F3864"/>
           <w:sz w:val="18"/>
         </w:rPr>
-        <w:t>Team Foundation Server · Microsoft Test Manager · C#</w:t>
+        <w:t>Team Foundation Server, Microsoft Test Manager, C#</w:t>
       </w:r>
     </w:p>
     <w:p>
@@ -822,7 +822,7 @@
           <w:color w:val="1F3864"/>
           <w:sz w:val="18"/>
         </w:rPr>
-        <w:t>Linux · Eclipse · Hudson · Ant · TestNG · Java · Selenium</w:t>
+        <w:t>Linux, Eclipse, Hudson, Ant, TestNG, Java, Selenium</w:t>
       </w:r>
     </w:p>
     <w:p>
@@ -907,7 +907,7 @@
           <w:color w:val="1F3864"/>
           <w:sz w:val="18"/>
         </w:rPr>
-        <w:t>C# · SQL · WTT · Kahuna Automation Framework (KAF) · NUnit · Source Depot · HyperV · Octopus</w:t>
+        <w:t>C#, SQL, WTT, Kahuna Automation Framework (KAF), NUnit, Source Depot, HyperV, Octopus</w:t>
       </w:r>
     </w:p>
     <w:p>
@@ -1010,7 +1010,7 @@
           <w:color w:val="1F3864"/>
           <w:sz w:val="18"/>
         </w:rPr>
-        <w:t>C# · SQL · WTT · Echo · KAF · NUnit · iMacros · REST · XML · HyperV</w:t>
+        <w:t>C#, SQL, WTT, Echo, KAF, NUnit, iMacros, REST, XML, HyperV</w:t>
       </w:r>
     </w:p>
     <w:p>
@@ -1131,7 +1131,7 @@
           <w:color w:val="1F3864"/>
           <w:sz w:val="18"/>
         </w:rPr>
-        <w:t>Borland JBuilder · Java · Swing · Borland C++ · Oracle SQL · PVCS/Serena</w:t>
+        <w:t>Borland JBuilder, Java, Swing, Borland C++, Oracle SQL, PVCS/Serena</w:t>
       </w:r>
     </w:p>
     <w:p>
@@ -1225,7 +1225,7 @@
           <w:color w:val="1F3864"/>
           <w:sz w:val="18"/>
         </w:rPr>
-        <w:t>Excel · iMacros · Visual Basic · Team Track</w:t>
+        <w:t>Excel, iMacros, Visual Basic, Team Track</w:t>
       </w:r>
     </w:p>
     <w:p>

</xml_diff>

<commit_message>
Regenerate resumes/cover letters (2026-09-01_042902)
</commit_message>
<xml_diff>
--- a/generated/SDE/Dennis Dole Resume (SDE).docx
+++ b/generated/SDE/Dennis Dole Resume (SDE).docx
@@ -357,9 +357,9 @@
         <w:tblLook w:firstColumn="1" w:firstRow="1" w:lastColumn="0" w:lastRow="0" w:noHBand="0" w:noVBand="1" w:val="04A0"/>
       </w:tblPr>
       <w:tblGrid>
-        <w:gridCol w:w="4037"/>
+        <w:gridCol w:w="3774"/>
         <w:gridCol w:w="4203"/>
-        <w:gridCol w:w="1839"/>
+        <w:gridCol w:w="2103"/>
       </w:tblGrid>
       <w:tr>
         <w:tc>
@@ -407,7 +407,7 @@
               <w:rPr>
                 <w:b/>
               </w:rPr>
-              <w:t>2024-03 to 2025-07</w:t>
+              <w:t>Mar 2024 to Jul 2025</w:t>
             </w:r>
           </w:p>
         </w:tc>
@@ -423,7 +423,7 @@
           <w:color w:val="1F3864"/>
           <w:sz w:val="18"/>
         </w:rPr>
-        <w:t>Docusign Connect, Connect Test Listener (webhook), Ruby Webhook Test Interface, x509 Certificate Management</w:t>
+        <w:t>Docusign Connect · Connect Test Listener (webhook) · Ruby Webhook Test Interface · x509 Certificate Management</w:t>
       </w:r>
     </w:p>
     <w:p>
@@ -478,9 +478,9 @@
         <w:tblLook w:firstColumn="1" w:firstRow="1" w:lastColumn="0" w:lastRow="0" w:noHBand="0" w:noVBand="1" w:val="04A0"/>
       </w:tblPr>
       <w:tblGrid>
-        <w:gridCol w:w="4037"/>
+        <w:gridCol w:w="3774"/>
         <w:gridCol w:w="4203"/>
-        <w:gridCol w:w="1839"/>
+        <w:gridCol w:w="2103"/>
       </w:tblGrid>
       <w:tr>
         <w:tc>
@@ -495,7 +495,7 @@
               <w:rPr>
                 <w:b/>
               </w:rPr>
-              <w:t>Software Design Engineer in Test</w:t>
+              <w:t>Software Design Engineer in Test (SDET)</w:t>
             </w:r>
           </w:p>
         </w:tc>
@@ -528,7 +528,7 @@
               <w:rPr>
                 <w:b/>
               </w:rPr>
-              <w:t>2013-11 to 2024-03</w:t>
+              <w:t>Nov 2013 to Mar 2024</w:t>
             </w:r>
           </w:p>
         </w:tc>
@@ -544,7 +544,7 @@
           <w:color w:val="1F3864"/>
           <w:sz w:val="18"/>
         </w:rPr>
-        <w:t>Docusign Connect, Product Incubation Team, Docusign Print Tool (deprecated)</w:t>
+        <w:t>Docusign Connect · Product Incubation Team · Docusign Print Tool (deprecated)</w:t>
       </w:r>
     </w:p>
     <w:p>
@@ -662,9 +662,9 @@
         <w:tblLook w:firstColumn="1" w:firstRow="1" w:lastColumn="0" w:lastRow="0" w:noHBand="0" w:noVBand="1" w:val="04A0"/>
       </w:tblPr>
       <w:tblGrid>
-        <w:gridCol w:w="4037"/>
+        <w:gridCol w:w="3774"/>
         <w:gridCol w:w="4203"/>
-        <w:gridCol w:w="1839"/>
+        <w:gridCol w:w="2103"/>
       </w:tblGrid>
       <w:tr>
         <w:tc>
@@ -712,7 +712,7 @@
               <w:rPr>
                 <w:b/>
               </w:rPr>
-              <w:t>2012-01 to 2013-06</w:t>
+              <w:t>Jan 2012 to Jun 2013</w:t>
             </w:r>
           </w:p>
         </w:tc>
@@ -728,7 +728,7 @@
           <w:color w:val="1F3864"/>
           <w:sz w:val="18"/>
         </w:rPr>
-        <w:t>Team Foundation Server, Microsoft Test Manager, C#</w:t>
+        <w:t>Team Foundation Server · Microsoft Test Manager · C#</w:t>
       </w:r>
     </w:p>
     <w:p>
@@ -756,9 +756,9 @@
         <w:tblLook w:firstColumn="1" w:firstRow="1" w:lastColumn="0" w:lastRow="0" w:noHBand="0" w:noVBand="1" w:val="04A0"/>
       </w:tblPr>
       <w:tblGrid>
-        <w:gridCol w:w="4037"/>
+        <w:gridCol w:w="3774"/>
         <w:gridCol w:w="4203"/>
-        <w:gridCol w:w="1839"/>
+        <w:gridCol w:w="2103"/>
       </w:tblGrid>
       <w:tr>
         <w:tc>
@@ -806,7 +806,7 @@
               <w:rPr>
                 <w:b/>
               </w:rPr>
-              <w:t>2011-11 to 2012-01</w:t>
+              <w:t>Nov 2011 to Jan 2012</w:t>
             </w:r>
           </w:p>
         </w:tc>
@@ -822,7 +822,7 @@
           <w:color w:val="1F3864"/>
           <w:sz w:val="18"/>
         </w:rPr>
-        <w:t>Linux, Eclipse, Hudson, Ant, TestNG, Java, Selenium</w:t>
+        <w:t>Linux · Eclipse · Hudson · Ant · TestNG · Java · Selenium</w:t>
       </w:r>
     </w:p>
     <w:p>
@@ -841,9 +841,9 @@
         <w:tblLook w:firstColumn="1" w:firstRow="1" w:lastColumn="0" w:lastRow="0" w:noHBand="0" w:noVBand="1" w:val="04A0"/>
       </w:tblPr>
       <w:tblGrid>
-        <w:gridCol w:w="4037"/>
+        <w:gridCol w:w="3774"/>
         <w:gridCol w:w="4203"/>
-        <w:gridCol w:w="1839"/>
+        <w:gridCol w:w="2103"/>
       </w:tblGrid>
       <w:tr>
         <w:tc>
@@ -891,7 +891,7 @@
               <w:rPr>
                 <w:b/>
               </w:rPr>
-              <w:t>2011-04 to 2011-10</w:t>
+              <w:t>Apr 2011 to Oct 2011</w:t>
             </w:r>
           </w:p>
         </w:tc>
@@ -907,7 +907,7 @@
           <w:color w:val="1F3864"/>
           <w:sz w:val="18"/>
         </w:rPr>
-        <w:t>C#, SQL, WTT, Kahuna Automation Framework (KAF), NUnit, Source Depot, HyperV, Octopus</w:t>
+        <w:t>C# · SQL · WTT · Kahuna Automation Framework (KAF) · NUnit · Source Depot · HyperV · Octopus</w:t>
       </w:r>
     </w:p>
     <w:p>
@@ -944,9 +944,9 @@
         <w:tblLook w:firstColumn="1" w:firstRow="1" w:lastColumn="0" w:lastRow="0" w:noHBand="0" w:noVBand="1" w:val="04A0"/>
       </w:tblPr>
       <w:tblGrid>
-        <w:gridCol w:w="4037"/>
+        <w:gridCol w:w="3774"/>
         <w:gridCol w:w="4203"/>
-        <w:gridCol w:w="1839"/>
+        <w:gridCol w:w="2103"/>
       </w:tblGrid>
       <w:tr>
         <w:tc>
@@ -994,7 +994,7 @@
               <w:rPr>
                 <w:b/>
               </w:rPr>
-              <w:t>2008-02 to 2010-11</w:t>
+              <w:t>Feb 2008 to Nov 2010</w:t>
             </w:r>
           </w:p>
         </w:tc>
@@ -1010,7 +1010,7 @@
           <w:color w:val="1F3864"/>
           <w:sz w:val="18"/>
         </w:rPr>
-        <w:t>C#, SQL, WTT, Echo, KAF, NUnit, iMacros, REST, XML, HyperV</w:t>
+        <w:t>C# · SQL · WTT · Echo · KAF · NUnit · iMacros · REST · XML · HyperV</w:t>
       </w:r>
     </w:p>
     <w:p>
@@ -1065,9 +1065,9 @@
         <w:tblLook w:firstColumn="1" w:firstRow="1" w:lastColumn="0" w:lastRow="0" w:noHBand="0" w:noVBand="1" w:val="04A0"/>
       </w:tblPr>
       <w:tblGrid>
-        <w:gridCol w:w="4037"/>
+        <w:gridCol w:w="3774"/>
         <w:gridCol w:w="4203"/>
-        <w:gridCol w:w="1839"/>
+        <w:gridCol w:w="2103"/>
       </w:tblGrid>
       <w:tr>
         <w:tc>
@@ -1115,7 +1115,7 @@
               <w:rPr>
                 <w:b/>
               </w:rPr>
-              <w:t>2006-03 to 2008-02</w:t>
+              <w:t>Mar 2006 to Feb 2008</w:t>
             </w:r>
           </w:p>
         </w:tc>
@@ -1131,7 +1131,7 @@
           <w:color w:val="1F3864"/>
           <w:sz w:val="18"/>
         </w:rPr>
-        <w:t>Borland JBuilder, Java, Swing, Borland C++, Oracle SQL, PVCS/Serena</w:t>
+        <w:t>Borland JBuilder · Java · Swing · Borland C++ · Oracle SQL · PVCS/Serena</w:t>
       </w:r>
     </w:p>
     <w:p>
@@ -1159,9 +1159,9 @@
         <w:tblLook w:firstColumn="1" w:firstRow="1" w:lastColumn="0" w:lastRow="0" w:noHBand="0" w:noVBand="1" w:val="04A0"/>
       </w:tblPr>
       <w:tblGrid>
-        <w:gridCol w:w="4037"/>
+        <w:gridCol w:w="3774"/>
         <w:gridCol w:w="4203"/>
-        <w:gridCol w:w="1839"/>
+        <w:gridCol w:w="2103"/>
       </w:tblGrid>
       <w:tr>
         <w:tc>
@@ -1209,7 +1209,7 @@
               <w:rPr>
                 <w:b/>
               </w:rPr>
-              <w:t>2005-03 to 2006-08</w:t>
+              <w:t>Mar 2005 to Aug 2006</w:t>
             </w:r>
           </w:p>
         </w:tc>
@@ -1225,7 +1225,7 @@
           <w:color w:val="1F3864"/>
           <w:sz w:val="18"/>
         </w:rPr>
-        <w:t>Excel, iMacros, Visual Basic, Team Track</w:t>
+        <w:t>Excel · iMacros · Visual Basic · Team Track</w:t>
       </w:r>
     </w:p>
     <w:p>

</xml_diff>